<commit_message>
chore(eval): re-render on the merged model the folders that changed on master since serial lane 2 branched, part 01 (fb-595.54.82)
</commit_message>
<xml_diff>
--- a/courts/fifth-circuit/louisiana/state/supreme-court/amicus-brief/usage/OUTPUT-amicus-brief.docx
+++ b/courts/fifth-circuit/louisiana/state/supreme-court/amicus-brief/usage/OUTPUT-amicus-brief.docx
@@ -9652,7 +9652,7 @@
         <w:noBreakHyphen/>
       </w:r>
       <w:r>
-        <w:t xml:space="preserve">777840, 34 (19th J.D.C., E.B.R., May 8, 2026). As Mr. Crockett stated in his Petition, the State’s action “effectively nullifies the will of the electorate and removes a constitutionally protected office without following required constitutional procedures.” .Pet. for Declaratory and Injunctive Relief at 3,</w:t>
+        <w:t xml:space="preserve">777840, 34 (19th J.D.C., E.B.R., May 8, 2026). As Mr. Crockett stated in his Petition, the State’s action “effectively nullifies the will of the electorate and removes a constitutionally protected office without following required constitutional procedures.” ⁠.Pet. for Declaratory and Injunctive Relief at 3,</w:t>
       </w:r>
       <w:r>
         <w:t xml:space="preserve"> </w:t>
@@ -9774,7 +9774,7 @@
         <w:t xml:space="preserve">v. Milligan</w:t>
       </w:r>
       <w:r>
-        <w:t xml:space="preserve">, 599 U.S. 1, 10 (2023). Yet the State has chosen to turn back the clock to a shameful era when the votes of Black people—even when cast without physical impediment—still would not count. The right to have one’s vote counted and an election’s results honored is essential to political participation. Without it, “the right of suffrage [is] denied by a debasement . . . of the weight of a citizen’s vote just as effectively as by wholly prohibiting the free exercise of the franchise.”</w:t>
+        <w:t xml:space="preserve">, 599 U.S. 1, 10 (2023). Yet the State has chosen to turn back the clock to a shameful era when the votes of Black people—even when cast without physical impediment—still would not count. The right to have one’s vote counted and an election’s results honored is essential to political participation. Without it, “the right of suffrage [is] denied by a debasement ⁠. ⁠. ⁠. of the weight of a citizen’s vote just as effectively as by wholly prohibiting the free exercise of the franchise.”</w:t>
       </w:r>
       <w:r>
         <w:t xml:space="preserve"> </w:t>
@@ -10290,7 +10290,7 @@
         <w:t xml:space="preserve">v. Sanderson Plumbing Prods., Inc.</w:t>
       </w:r>
       <w:r>
-        <w:t xml:space="preserve">, 530 U.S. 133, 147 (2000) (holding that, when someone offers a demonstrably false or nonsensical purpose for an action with a discriminatory effect, the court can “reasonably infer from [such] falsity . . . that the [defendant] is dissembling to cover up a discriminatory purpose”);</w:t>
+        <w:t xml:space="preserve">, 530 U.S. 133, 147 (2000) (holding that, when someone offers a demonstrably false or nonsensical purpose for an action with a discriminatory effect, the court can “reasonably infer from [such] falsity ⁠. ⁠. ⁠. that the [defendant] is dissembling to cover up a discriminatory purpose”);</w:t>
       </w:r>
       <w:r>
         <w:t xml:space="preserve"> </w:t>
@@ -10327,7 +10327,7 @@
         <w:t xml:space="preserve">of Commerce v. New York</w:t>
       </w:r>
       <w:r>
-        <w:t xml:space="preserve">, 588 U.S. 752, 785 (2019) (reasoning that courts “cannot ignore the disconnect between the decision made and the explanation given . . . [and] are not required to exhibit a naiveté from which ordinary citizens are free”) (internal punctuation and citations omitted);</w:t>
+        <w:t xml:space="preserve">, 588 U.S. 752, 785 (2019) (reasoning that courts “cannot ignore the disconnect between the decision made and the explanation given ⁠. ⁠. ⁠. [and] are not required to exhibit a naiveté from which ordinary citizens are free”) (internal punctuation and citations omitted);</w:t>
       </w:r>
       <w:r>
         <w:t xml:space="preserve"> </w:t>
@@ -10610,7 +10610,7 @@
         <w:t xml:space="preserve"> </w:t>
       </w:r>
       <w:r>
-        <w:t xml:space="preserve">CONST. art. V, § 28(A) (emphasis added). This reflects the general presumption that legislatively created offices must be “filled by an election of the voters . . . as the act specifies, and that only vacancies arising in an office already filled by election should be filled by the Governor for the remainder of the unexpired term.”</w:t>
+        <w:t xml:space="preserve">CONST. art. V, § 28(A) (emphasis added). This reflects the general presumption that legislatively created offices must be “filled by an election of the voters ⁠. ⁠. ⁠. as the act specifies, and that only vacancies arising in an office already filled by election should be filled by the Governor for the remainder of the unexpired term.”</w:t>
       </w:r>
       <w:r>
         <w:t xml:space="preserve"> </w:t>
@@ -11286,7 +11286,7 @@
         <w:t xml:space="preserve"> </w:t>
       </w:r>
       <w:r>
-        <w:t xml:space="preserve">By its terms, the statute provides that “[a]ny usurper who attempts to exercise the functions of a public officer or office, and who interferes with any public officer in the discharge of his duties . . . shall be fined not more than five hundred dollars or imprisoned not more than six months, or both.” LA.</w:t>
+        <w:t xml:space="preserve">By its terms, the statute provides that “[a]ny usurper who attempts to exercise the functions of a public officer or office, and who interferes with any public officer in the discharge of his duties ⁠. ⁠. ⁠. shall be fined not more than five hundred dollars or imprisoned not more than six months, or both.” LA.</w:t>
       </w:r>
       <w:r>
         <w:t xml:space="preserve"> </w:t>
@@ -15548,7 +15548,7 @@
         <w:t xml:space="preserve"> </w:t>
       </w:r>
       <w:r>
-        <w:t xml:space="preserve">Jordan Sieder, ‘Never Seen Something So Barbaric’: Louisiana Republicans Push to Eliminate An Elected Position Won By Exonerated Black Man, ATLANTA BLACK STAR (Apr. 13, 2026), https://​atlantablackstar.​com/​2026/​04/​13/​louisiana-​republicans-​push-​to-​eliminate-​anelected-​positionwon-​by-​exonerated-​black-​man/ (reporting that SB 256’s author, Senator Morris, said the intent of the bill is to “‘provide some efficiencies’ and bring Orleans Parish in line with the rest of the state . . . .”); Jack</w:t>
+        <w:t xml:space="preserve">Jordan Sieder, ‘Never Seen Something So Barbaric’: Louisiana Republicans Push to Eliminate An Elected Position Won By Exonerated Black Man, ATLANTA BLACK STAR (Apr. 13, 2026), https://​atlantablackstar.​com/​2026/​04/​13/​louisiana-​republicans-​push-​to-​eliminate-​anelected-​positionwon-​by-​exonerated-​black-​man/ (reporting that SB 256’s author, Senator Morris, said the intent of the bill is to “‘provide some efficiencies’ and bring Orleans Parish in line with the rest of the state ⁠. ⁠. ⁠. ⁠.”); Jack</w:t>
       </w:r>
       <w:r>
         <w:t xml:space="preserve"> </w:t>
@@ -15933,7 +15933,7 @@
         <w:t xml:space="preserve"> </w:t>
       </w:r>
       <w:r>
-        <w:t xml:space="preserve">Murrill, Att’y Gen. of La., Letter to Judge Calvin Johnson regarding New Orleans City Council’s May 11 Resolutions for Interim Clerk of Court (May 13, 2026), https://​www.​ag.​state.​la.​us/​Files/​Article/​517/​Documents/​2026.​05.​13AGLettertoJudgeJohnson.​pdf .</w:t>
+        <w:t xml:space="preserve">Murrill, Att’y Gen. of La., Letter to Judge Calvin Johnson regarding New Orleans City Council’s May 11 Resolutions for Interim Clerk of Court (May 13, 2026), https://​www.​ag.​state.​la.​us/​Files/​Article/​517/​Documents/​2026.​05.​13AGLettertoJudgeJohnson.​pdf ⁠.</w:t>
       </w:r>
     </w:p>
   </w:footnote>
@@ -16048,7 +16048,7 @@
         <w:noBreakHyphen/>
       </w:r>
       <w:r>
-        <w:t xml:space="preserve">9 (emphasis in original), available at https://​babel.​hathitrust.​org/​cgi/​pt?​id=osu.​32435011891801&amp;seq=18.</w:t>
+        <w:t xml:space="preserve">9 (emphasis in original), available at https://​babel.​hathitrust.​org/​cgi/​pt?​id=osu.​32435011891801&amp;​seq=18.</w:t>
       </w:r>
     </w:p>
   </w:footnote>
@@ -16264,7 +16264,7 @@
         <w:t xml:space="preserve"> </w:t>
       </w:r>
       <w:r>
-        <w:t xml:space="preserve">Senate Calendar of the State of Louisiana, Thirty-Second Extraordinary Session of the Legislature Under the Constitution of 1921, at 10 [hereinafter 1960 SENATE CALENDAR] (citing H. Con. Res. 18, 1960 Leg., 30th Extraordinary Sess. (La. 1960)), available at https://​babel.​hathitrust.​org/​cgi/​pt?​id=uc1.​b2905455&amp;seq=642&amp;q1=usurp&amp;start=1.</w:t>
+        <w:t xml:space="preserve">Senate Calendar of the State of Louisiana, Thirty-Second Extraordinary Session of the Legislature Under the Constitution of 1921, at 10 [hereinafter 1960 SENATE CALENDAR] (citing H. Con. Res. 18, 1960 Leg., 30th Extraordinary Sess. (La. 1960)), available at https://​babel.​hathitrust.​org/​cgi/​pt?​id=uc1.​b2905455&amp;​seq=642&amp;​q1=usurp&amp;​start=1.</w:t>
       </w:r>
     </w:p>
   </w:footnote>
@@ -16289,7 +16289,7 @@
         <w:t xml:space="preserve"> </w:t>
       </w:r>
       <w:r>
-        <w:t xml:space="preserve">Gets Ouster Notice, TIMES-PICAYUNE, Jan. 13, 1961, at 2, available at https://​www.​newspapers.​com/​image/​1250951917/​?​match=1&amp;terms=Redmond.</w:t>
+        <w:t xml:space="preserve">Gets Ouster Notice, TIMES-PICAYUNE, Jan. 13, 1961, at 2, available at https://​www.​newspapers.​com/​image/​1250951917/​?​match=1&amp;​terms=Redmond.</w:t>
       </w:r>
     </w:p>
   </w:footnote>

</xml_diff>